<commit_message>
feat: sync latest resume updates from Jonathan_Bouligny_Resumes_CURRENT
</commit_message>
<xml_diff>
--- a/static/Jonathan_Bouligny_Resume.docx
+++ b/static/Jonathan_Bouligny_Resume.docx
@@ -194,7 +194,7 @@
           <w:sz w:val="19"/>
           <w:szCs w:val="20"/>
         </w:rPr>
-        <w:t>Infrastructure engineer with 6+ years automating enterprise Linux environments at Red Hat and Lockheed Martin, working in Ansible, Terraform, Python, and containers. Red Hat Certified Architect in Ansible. Currently building a GitOps-managed Kubernetes platform from scratch.</w:t>
+        <w:t>Infrastructure engineer with 6+ years automating enterprise Linux environments at Red Hat and Lockheed Martin, working in Ansible, Terraform, Python, and containers. Red Hat Certified Architect in Ansible. Currently building a GitOps-managed Kubernetes platform with SRE practices (SLOs, burn-rate alerting) from scratch.</w:t>
       </w:r>
     </w:p>
     <w:p>
@@ -342,7 +342,7 @@
           <w:sz w:val="19"/>
           <w:szCs w:val="20"/>
         </w:rPr>
-        <w:t xml:space="preserve">Observability:  </w:t>
+        <w:t xml:space="preserve">Observability &amp; SRE:  </w:t>
       </w:r>
       <w:r>
         <w:rPr>
@@ -466,7 +466,7 @@
           <w:sz w:val="19"/>
           <w:szCs w:val="20"/>
         </w:rPr>
-        <w:t>Monitor the platform with Prometheus and Grafana through the same GitOps workflow, with a 99% availability SLO and multiwindow burn-rate alerts (page on fast burns, ticket on slow).</w:t>
+        <w:t>Applied SRE practices to the platform, monitoring it with Prometheus and Grafana through the same GitOps workflow, with a 99% availability SLO and multiwindow burn-rate alerts (page on fast burns, ticket on slow).</w:t>
       </w:r>
     </w:p>
     <w:p>

</xml_diff>